<commit_message>
Typo Fixes and Addition of launcher to projects page
</commit_message>
<xml_diff>
--- a/res/Mueller_Resume.docx
+++ b/res/Mueller_Resume.docx
@@ -27,13 +27,6 @@
           <w:sz w:val="20"/>
         </w:rPr>
       </w:pPr>
-      <w:r>
-        <w:rPr>
-          <w:rFonts w:ascii="Book Antiqua" w:hAnsi="Book Antiqua"/>
-          <w:sz w:val="20"/>
-        </w:rPr>
-        <w:t xml:space="preserve">3237 Neptune Dr.  </w:t>
-      </w:r>
       <w:r>
         <w:rPr>
           <w:rFonts w:ascii="Book Antiqua" w:hAnsi="Book Antiqua"/>
@@ -427,6 +420,13 @@
         </w:rPr>
         <w:t>ne</w:t>
       </w:r>
+      <w:r>
+        <w:rPr>
+          <w:rFonts w:ascii="Book Antiqua" w:hAnsi="Book Antiqua"/>
+          <w:sz w:val="20"/>
+        </w:rPr>
+        <w:t>, MySQL</w:t>
+      </w:r>
     </w:p>
     <w:p>
       <w:pPr>
@@ -496,84 +496,48 @@
         <w:t>PROFESSIONAL AFFILIATIONS &amp; COMMUNITY ACTIVITIES</w:t>
       </w:r>
     </w:p>
-    <w:tbl>
-      <w:tblPr>
-        <w:tblW w:w="0" w:type="auto"/>
-        <w:tblLook w:val="0000" w:firstRow="0" w:lastRow="0" w:firstColumn="0" w:lastColumn="0" w:noHBand="0" w:noVBand="0"/>
-      </w:tblPr>
-      <w:tblGrid>
-        <w:gridCol w:w="5364"/>
-      </w:tblGrid>
-      <w:tr>
-        <w:tc>
-          <w:tcPr>
-            <w:tcW w:w="5364" w:type="dxa"/>
-          </w:tcPr>
-          <w:p>
-            <w:pPr>
-              <w:numPr>
-                <w:ilvl w:val="0"/>
-                <w:numId w:val="2"/>
-              </w:numPr>
-              <w:tabs>
-                <w:tab w:val="clear" w:pos="720"/>
-                <w:tab w:val="num" w:pos="180"/>
-              </w:tabs>
-              <w:spacing w:before="60"/>
-              <w:ind w:left="180" w:hanging="180"/>
-              <w:rPr>
-                <w:rFonts w:ascii="Book Antiqua" w:hAnsi="Book Antiqua"/>
-                <w:sz w:val="20"/>
-              </w:rPr>
-            </w:pPr>
-            <w:r>
-              <w:rPr>
-                <w:rFonts w:ascii="Book Antiqua" w:hAnsi="Book Antiqua"/>
-                <w:sz w:val="20"/>
-              </w:rPr>
-              <w:t xml:space="preserve">Volunteer Coach, Bantam Weight Sports Association </w:t>
-            </w:r>
-          </w:p>
-          <w:p>
-            <w:pPr>
-              <w:numPr>
-                <w:ilvl w:val="0"/>
-                <w:numId w:val="2"/>
-              </w:numPr>
-              <w:tabs>
-                <w:tab w:val="clear" w:pos="720"/>
-                <w:tab w:val="num" w:pos="180"/>
-              </w:tabs>
-              <w:spacing w:before="60"/>
-              <w:ind w:left="180" w:hanging="180"/>
-              <w:rPr>
-                <w:rFonts w:ascii="Book Antiqua" w:hAnsi="Book Antiqua"/>
-                <w:sz w:val="20"/>
-              </w:rPr>
-            </w:pPr>
-            <w:r>
-              <w:rPr>
-                <w:rFonts w:ascii="Book Antiqua" w:hAnsi="Book Antiqua"/>
-                <w:sz w:val="20"/>
-              </w:rPr>
-              <w:t>Volunteer Coach, Southwest Sports Association</w:t>
-            </w:r>
-          </w:p>
-          <w:p>
-            <w:pPr>
-              <w:spacing w:before="60"/>
-              <w:ind w:left="180"/>
-              <w:rPr>
-                <w:rFonts w:ascii="Book Antiqua" w:hAnsi="Book Antiqua"/>
-                <w:sz w:val="20"/>
-              </w:rPr>
-            </w:pPr>
-          </w:p>
-        </w:tc>
-      </w:tr>
-    </w:tbl>
-    <w:p>
-      <w:pPr>
+    <w:p>
+      <w:pPr>
+        <w:pStyle w:val="ListParagraph"/>
+        <w:numPr>
+          <w:ilvl w:val="0"/>
+          <w:numId w:val="2"/>
+        </w:numPr>
+        <w:spacing w:before="60"/>
+        <w:rPr>
+          <w:rFonts w:ascii="Book Antiqua" w:hAnsi="Book Antiqua"/>
+          <w:sz w:val="20"/>
+        </w:rPr>
+      </w:pPr>
+      <w:r>
+        <w:rPr>
+          <w:rFonts w:ascii="Book Antiqua" w:hAnsi="Book Antiqua"/>
+          <w:sz w:val="20"/>
+        </w:rPr>
+        <w:t>Volunteer Coach, Bantam Weight Sports</w:t>
+      </w:r>
+      <w:r>
+        <w:rPr>
+          <w:rFonts w:ascii="Book Antiqua" w:hAnsi="Book Antiqua"/>
+          <w:sz w:val="20"/>
+        </w:rPr>
+        <w:t xml:space="preserve"> </w:t>
+      </w:r>
+      <w:r>
+        <w:rPr>
+          <w:rFonts w:ascii="Book Antiqua" w:hAnsi="Book Antiqua"/>
+          <w:sz w:val="20"/>
+        </w:rPr>
+        <w:t xml:space="preserve">Association </w:t>
+      </w:r>
+    </w:p>
+    <w:p>
+      <w:pPr>
+        <w:pStyle w:val="ListParagraph"/>
+        <w:numPr>
+          <w:ilvl w:val="0"/>
+          <w:numId w:val="2"/>
+        </w:numPr>
         <w:pBdr>
           <w:bottom w:val="thinThickSmallGap" w:sz="24" w:space="31" w:color="auto"/>
         </w:pBdr>
@@ -584,8 +548,706 @@
           <w:sz w:val="20"/>
         </w:rPr>
       </w:pPr>
-    </w:p>
-    <w:p/>
+      <w:r>
+        <w:rPr>
+          <w:rFonts w:ascii="Book Antiqua" w:hAnsi="Book Antiqua"/>
+          <w:sz w:val="20"/>
+        </w:rPr>
+        <w:t>Volunteer Coach, Southwest Sports Association</w:t>
+      </w:r>
+    </w:p>
+    <w:p>
+      <w:pPr>
+        <w:jc w:val="center"/>
+        <w:rPr>
+          <w:i/>
+          <w:iCs/>
+          <w:color w:val="0F4761" w:themeColor="accent1" w:themeShade="BF"/>
+        </w:rPr>
+      </w:pPr>
+    </w:p>
+    <w:p>
+      <w:pPr>
+        <w:jc w:val="center"/>
+        <w:rPr>
+          <w:i/>
+          <w:iCs/>
+          <w:color w:val="0F4761" w:themeColor="accent1" w:themeShade="BF"/>
+        </w:rPr>
+      </w:pPr>
+      <w:r>
+        <w:rPr>
+          <w:i/>
+          <w:iCs/>
+          <w:color w:val="0F4761" w:themeColor="accent1" w:themeShade="BF"/>
+        </w:rPr>
+        <w:t>Projects</w:t>
+      </w:r>
+    </w:p>
+    <w:p>
+      <w:pPr>
+        <w:pStyle w:val="ListParagraph"/>
+        <w:numPr>
+          <w:ilvl w:val="0"/>
+          <w:numId w:val="7"/>
+        </w:numPr>
+        <w:rPr>
+          <w:rFonts w:ascii="Book Antiqua" w:hAnsi="Book Antiqua"/>
+          <w:color w:val="0F4761" w:themeColor="accent1" w:themeShade="BF"/>
+          <w:sz w:val="20"/>
+          <w:szCs w:val="20"/>
+        </w:rPr>
+      </w:pPr>
+      <w:r>
+        <w:rPr>
+          <w:rFonts w:ascii="Book Antiqua" w:hAnsi="Book Antiqua"/>
+          <w:color w:val="0F4761" w:themeColor="accent1" w:themeShade="BF"/>
+          <w:sz w:val="20"/>
+          <w:szCs w:val="20"/>
+        </w:rPr>
+        <w:t>J Compiler</w:t>
+      </w:r>
+    </w:p>
+    <w:p>
+      <w:pPr>
+        <w:pStyle w:val="ListParagraph"/>
+        <w:numPr>
+          <w:ilvl w:val="1"/>
+          <w:numId w:val="7"/>
+        </w:numPr>
+        <w:rPr>
+          <w:rFonts w:ascii="Book Antiqua" w:hAnsi="Book Antiqua"/>
+          <w:color w:val="0F4761" w:themeColor="accent1" w:themeShade="BF"/>
+          <w:sz w:val="20"/>
+          <w:szCs w:val="20"/>
+        </w:rPr>
+      </w:pPr>
+      <w:r>
+        <w:rPr>
+          <w:rFonts w:ascii="Book Antiqua" w:hAnsi="Book Antiqua"/>
+          <w:color w:val="0F4761" w:themeColor="accent1" w:themeShade="BF"/>
+          <w:sz w:val="20"/>
+          <w:szCs w:val="20"/>
+        </w:rPr>
+        <w:t>Created a compiler for a programming language named J created by Professor Jonathon Cook at NMSU</w:t>
+      </w:r>
+      <w:r>
+        <w:rPr>
+          <w:rFonts w:ascii="Book Antiqua" w:hAnsi="Book Antiqua"/>
+          <w:color w:val="0F4761" w:themeColor="accent1" w:themeShade="BF"/>
+          <w:sz w:val="20"/>
+          <w:szCs w:val="20"/>
+        </w:rPr>
+        <w:t xml:space="preserve"> and was a solo </w:t>
+      </w:r>
+      <w:r>
+        <w:rPr>
+          <w:rFonts w:ascii="Book Antiqua" w:hAnsi="Book Antiqua"/>
+          <w:color w:val="0F4761" w:themeColor="accent1" w:themeShade="BF"/>
+          <w:sz w:val="20"/>
+          <w:szCs w:val="20"/>
+        </w:rPr>
+        <w:t>.</w:t>
+      </w:r>
+    </w:p>
+    <w:p>
+      <w:pPr>
+        <w:pStyle w:val="ListParagraph"/>
+        <w:numPr>
+          <w:ilvl w:val="1"/>
+          <w:numId w:val="7"/>
+        </w:numPr>
+        <w:rPr>
+          <w:rFonts w:ascii="Book Antiqua" w:hAnsi="Book Antiqua"/>
+          <w:color w:val="0F4761" w:themeColor="accent1" w:themeShade="BF"/>
+          <w:sz w:val="20"/>
+          <w:szCs w:val="20"/>
+        </w:rPr>
+      </w:pPr>
+      <w:r>
+        <w:rPr>
+          <w:rFonts w:ascii="Book Antiqua" w:hAnsi="Book Antiqua"/>
+          <w:color w:val="0F4761" w:themeColor="accent1" w:themeShade="BF"/>
+          <w:sz w:val="20"/>
+          <w:szCs w:val="20"/>
+        </w:rPr>
+        <w:t>The compiler uses Yacc and Lex in C to compile J code into Risc-V assembly. This compiler handles user-built functions</w:t>
+      </w:r>
+      <w:r>
+        <w:rPr>
+          <w:rFonts w:ascii="Book Antiqua" w:hAnsi="Book Antiqua"/>
+          <w:color w:val="0F4761" w:themeColor="accent1" w:themeShade="BF"/>
+          <w:sz w:val="20"/>
+          <w:szCs w:val="20"/>
+        </w:rPr>
+        <w:t>, basic functions such as a print method, if-then-else statements, argument passing, global and local variables, expressions, and handles while loops. J is a very keyword heavy language.</w:t>
+      </w:r>
+    </w:p>
+    <w:p>
+      <w:pPr>
+        <w:pStyle w:val="ListParagraph"/>
+        <w:numPr>
+          <w:ilvl w:val="0"/>
+          <w:numId w:val="7"/>
+        </w:numPr>
+        <w:rPr>
+          <w:rFonts w:ascii="Book Antiqua" w:hAnsi="Book Antiqua"/>
+          <w:color w:val="0F4761" w:themeColor="accent1" w:themeShade="BF"/>
+          <w:sz w:val="20"/>
+          <w:szCs w:val="20"/>
+        </w:rPr>
+      </w:pPr>
+      <w:r>
+        <w:rPr>
+          <w:rFonts w:ascii="Book Antiqua" w:hAnsi="Book Antiqua"/>
+          <w:color w:val="0F4761" w:themeColor="accent1" w:themeShade="BF"/>
+          <w:sz w:val="20"/>
+          <w:szCs w:val="20"/>
+        </w:rPr>
+        <w:t>In The Depths</w:t>
+      </w:r>
+    </w:p>
+    <w:p>
+      <w:pPr>
+        <w:pStyle w:val="ListParagraph"/>
+        <w:numPr>
+          <w:ilvl w:val="1"/>
+          <w:numId w:val="7"/>
+        </w:numPr>
+        <w:rPr>
+          <w:rFonts w:ascii="Book Antiqua" w:hAnsi="Book Antiqua"/>
+          <w:color w:val="0F4761" w:themeColor="accent1" w:themeShade="BF"/>
+          <w:sz w:val="20"/>
+          <w:szCs w:val="20"/>
+        </w:rPr>
+      </w:pPr>
+      <w:r>
+        <w:rPr>
+          <w:rFonts w:ascii="Book Antiqua" w:hAnsi="Book Antiqua"/>
+          <w:color w:val="0F4761" w:themeColor="accent1" w:themeShade="BF"/>
+          <w:sz w:val="20"/>
+          <w:szCs w:val="20"/>
+        </w:rPr>
+        <w:t>“</w:t>
+      </w:r>
+      <w:r>
+        <w:rPr>
+          <w:rFonts w:ascii="Book Antiqua" w:hAnsi="Book Antiqua"/>
+          <w:color w:val="0F4761" w:themeColor="accent1" w:themeShade="BF"/>
+          <w:sz w:val="20"/>
+          <w:szCs w:val="20"/>
+        </w:rPr>
+        <w:t>In The Depths</w:t>
+      </w:r>
+      <w:r>
+        <w:rPr>
+          <w:rFonts w:ascii="Book Antiqua" w:hAnsi="Book Antiqua"/>
+          <w:color w:val="0F4761" w:themeColor="accent1" w:themeShade="BF"/>
+          <w:sz w:val="20"/>
+          <w:szCs w:val="20"/>
+        </w:rPr>
+        <w:t>”</w:t>
+      </w:r>
+      <w:r>
+        <w:rPr>
+          <w:rFonts w:ascii="Book Antiqua" w:hAnsi="Book Antiqua"/>
+          <w:color w:val="0F4761" w:themeColor="accent1" w:themeShade="BF"/>
+          <w:sz w:val="20"/>
+          <w:szCs w:val="20"/>
+        </w:rPr>
+        <w:t xml:space="preserve"> </w:t>
+      </w:r>
+      <w:r>
+        <w:rPr>
+          <w:rFonts w:ascii="Book Antiqua" w:hAnsi="Book Antiqua"/>
+          <w:color w:val="0F4761" w:themeColor="accent1" w:themeShade="BF"/>
+          <w:sz w:val="20"/>
+          <w:szCs w:val="20"/>
+        </w:rPr>
+        <w:t>had a team of</w:t>
+      </w:r>
+      <w:r>
+        <w:rPr>
+          <w:rFonts w:ascii="Book Antiqua" w:hAnsi="Book Antiqua"/>
+          <w:color w:val="0F4761" w:themeColor="accent1" w:themeShade="BF"/>
+          <w:sz w:val="20"/>
+          <w:szCs w:val="20"/>
+        </w:rPr>
+        <w:t xml:space="preserve"> three developers</w:t>
+      </w:r>
+      <w:r>
+        <w:rPr>
+          <w:rFonts w:ascii="Book Antiqua" w:hAnsi="Book Antiqua"/>
+          <w:color w:val="0F4761" w:themeColor="accent1" w:themeShade="BF"/>
+          <w:sz w:val="20"/>
+          <w:szCs w:val="20"/>
+        </w:rPr>
+        <w:t xml:space="preserve"> and was developed using the Godot Game Engine and programming language</w:t>
+      </w:r>
+      <w:r>
+        <w:rPr>
+          <w:rFonts w:ascii="Book Antiqua" w:hAnsi="Book Antiqua"/>
+          <w:color w:val="0F4761" w:themeColor="accent1" w:themeShade="BF"/>
+          <w:sz w:val="20"/>
+          <w:szCs w:val="20"/>
+        </w:rPr>
+        <w:t>.</w:t>
+      </w:r>
+    </w:p>
+    <w:p>
+      <w:pPr>
+        <w:pStyle w:val="ListParagraph"/>
+        <w:numPr>
+          <w:ilvl w:val="1"/>
+          <w:numId w:val="7"/>
+        </w:numPr>
+        <w:rPr>
+          <w:rFonts w:ascii="Book Antiqua" w:hAnsi="Book Antiqua"/>
+          <w:color w:val="0F4761" w:themeColor="accent1" w:themeShade="BF"/>
+          <w:sz w:val="20"/>
+          <w:szCs w:val="20"/>
+        </w:rPr>
+      </w:pPr>
+      <w:r>
+        <w:rPr>
+          <w:rFonts w:ascii="Book Antiqua" w:hAnsi="Book Antiqua"/>
+          <w:color w:val="0F4761" w:themeColor="accent1" w:themeShade="BF"/>
+          <w:sz w:val="20"/>
+          <w:szCs w:val="20"/>
+        </w:rPr>
+        <w:lastRenderedPageBreak/>
+        <w:t xml:space="preserve">“In The Depths” </w:t>
+      </w:r>
+      <w:r>
+        <w:rPr>
+          <w:rFonts w:ascii="Book Antiqua" w:hAnsi="Book Antiqua"/>
+          <w:color w:val="0F4761" w:themeColor="accent1" w:themeShade="BF"/>
+          <w:sz w:val="20"/>
+          <w:szCs w:val="20"/>
+        </w:rPr>
+        <w:t xml:space="preserve">is a </w:t>
+      </w:r>
+      <w:r>
+        <w:rPr>
+          <w:rFonts w:ascii="Book Antiqua" w:hAnsi="Book Antiqua"/>
+          <w:color w:val="0F4761" w:themeColor="accent1" w:themeShade="BF"/>
+          <w:sz w:val="20"/>
+          <w:szCs w:val="20"/>
+        </w:rPr>
+        <w:t xml:space="preserve">single player </w:t>
+      </w:r>
+      <w:r>
+        <w:rPr>
+          <w:rFonts w:ascii="Book Antiqua" w:hAnsi="Book Antiqua"/>
+          <w:color w:val="0F4761" w:themeColor="accent1" w:themeShade="BF"/>
+          <w:sz w:val="20"/>
+          <w:szCs w:val="20"/>
+        </w:rPr>
+        <w:t>game in which the player is inside a dungeon and is fighting creatures by clicking with the sole goal of getting stronger and defeating stronger enemies.</w:t>
+      </w:r>
+    </w:p>
+    <w:p>
+      <w:pPr>
+        <w:pStyle w:val="ListParagraph"/>
+        <w:numPr>
+          <w:ilvl w:val="0"/>
+          <w:numId w:val="7"/>
+        </w:numPr>
+        <w:rPr>
+          <w:rFonts w:ascii="Book Antiqua" w:hAnsi="Book Antiqua"/>
+          <w:color w:val="0F4761" w:themeColor="accent1" w:themeShade="BF"/>
+          <w:sz w:val="20"/>
+          <w:szCs w:val="20"/>
+        </w:rPr>
+      </w:pPr>
+      <w:r>
+        <w:rPr>
+          <w:rFonts w:ascii="Book Antiqua" w:hAnsi="Book Antiqua"/>
+          <w:color w:val="0F4761" w:themeColor="accent1" w:themeShade="BF"/>
+          <w:sz w:val="20"/>
+          <w:szCs w:val="20"/>
+        </w:rPr>
+        <w:t>ScheduleBuilderAI</w:t>
+      </w:r>
+    </w:p>
+    <w:p>
+      <w:pPr>
+        <w:pStyle w:val="ListParagraph"/>
+        <w:numPr>
+          <w:ilvl w:val="1"/>
+          <w:numId w:val="7"/>
+        </w:numPr>
+        <w:rPr>
+          <w:rFonts w:ascii="Book Antiqua" w:hAnsi="Book Antiqua"/>
+          <w:color w:val="0F4761" w:themeColor="accent1" w:themeShade="BF"/>
+          <w:sz w:val="20"/>
+          <w:szCs w:val="20"/>
+        </w:rPr>
+      </w:pPr>
+      <w:r>
+        <w:rPr>
+          <w:rFonts w:ascii="Book Antiqua" w:hAnsi="Book Antiqua"/>
+          <w:color w:val="0F4761" w:themeColor="accent1" w:themeShade="BF"/>
+          <w:sz w:val="20"/>
+          <w:szCs w:val="20"/>
+        </w:rPr>
+        <w:t>“</w:t>
+      </w:r>
+      <w:r>
+        <w:rPr>
+          <w:rFonts w:ascii="Book Antiqua" w:hAnsi="Book Antiqua"/>
+          <w:color w:val="0F4761" w:themeColor="accent1" w:themeShade="BF"/>
+          <w:sz w:val="20"/>
+          <w:szCs w:val="20"/>
+        </w:rPr>
+        <w:t>ScheduleBuilderAI</w:t>
+      </w:r>
+      <w:r>
+        <w:rPr>
+          <w:rFonts w:ascii="Book Antiqua" w:hAnsi="Book Antiqua"/>
+          <w:color w:val="0F4761" w:themeColor="accent1" w:themeShade="BF"/>
+          <w:sz w:val="20"/>
+          <w:szCs w:val="20"/>
+        </w:rPr>
+        <w:t>”</w:t>
+      </w:r>
+      <w:r>
+        <w:rPr>
+          <w:rFonts w:ascii="Book Antiqua" w:hAnsi="Book Antiqua"/>
+          <w:color w:val="0F4761" w:themeColor="accent1" w:themeShade="BF"/>
+          <w:sz w:val="20"/>
+          <w:szCs w:val="20"/>
+        </w:rPr>
+        <w:t xml:space="preserve"> was a solo-project</w:t>
+      </w:r>
+      <w:r>
+        <w:rPr>
+          <w:rFonts w:ascii="Book Antiqua" w:hAnsi="Book Antiqua"/>
+          <w:color w:val="0F4761" w:themeColor="accent1" w:themeShade="BF"/>
+          <w:sz w:val="20"/>
+          <w:szCs w:val="20"/>
+        </w:rPr>
+        <w:t xml:space="preserve"> completed in python</w:t>
+      </w:r>
+      <w:r>
+        <w:rPr>
+          <w:rFonts w:ascii="Book Antiqua" w:hAnsi="Book Antiqua"/>
+          <w:color w:val="0F4761" w:themeColor="accent1" w:themeShade="BF"/>
+          <w:sz w:val="20"/>
+          <w:szCs w:val="20"/>
+        </w:rPr>
+        <w:t>.</w:t>
+      </w:r>
+    </w:p>
+    <w:p>
+      <w:pPr>
+        <w:pStyle w:val="ListParagraph"/>
+        <w:numPr>
+          <w:ilvl w:val="1"/>
+          <w:numId w:val="7"/>
+        </w:numPr>
+        <w:rPr>
+          <w:rFonts w:ascii="Book Antiqua" w:hAnsi="Book Antiqua"/>
+          <w:color w:val="0F4761" w:themeColor="accent1" w:themeShade="BF"/>
+          <w:sz w:val="20"/>
+          <w:szCs w:val="20"/>
+        </w:rPr>
+      </w:pPr>
+      <w:r>
+        <w:rPr>
+          <w:rFonts w:ascii="Book Antiqua" w:hAnsi="Book Antiqua"/>
+          <w:color w:val="0F4761" w:themeColor="accent1" w:themeShade="BF"/>
+          <w:sz w:val="20"/>
+          <w:szCs w:val="20"/>
+        </w:rPr>
+        <w:t>“</w:t>
+      </w:r>
+      <w:r>
+        <w:rPr>
+          <w:rFonts w:ascii="Book Antiqua" w:hAnsi="Book Antiqua"/>
+          <w:color w:val="0F4761" w:themeColor="accent1" w:themeShade="BF"/>
+          <w:sz w:val="20"/>
+          <w:szCs w:val="20"/>
+        </w:rPr>
+        <w:t>ScheduleBuilderAI</w:t>
+      </w:r>
+      <w:r>
+        <w:rPr>
+          <w:rFonts w:ascii="Book Antiqua" w:hAnsi="Book Antiqua"/>
+          <w:color w:val="0F4761" w:themeColor="accent1" w:themeShade="BF"/>
+          <w:sz w:val="20"/>
+          <w:szCs w:val="20"/>
+        </w:rPr>
+        <w:t>”</w:t>
+      </w:r>
+      <w:r>
+        <w:rPr>
+          <w:rFonts w:ascii="Book Antiqua" w:hAnsi="Book Antiqua"/>
+          <w:color w:val="0F4761" w:themeColor="accent1" w:themeShade="BF"/>
+          <w:sz w:val="20"/>
+          <w:szCs w:val="20"/>
+        </w:rPr>
+        <w:t xml:space="preserve"> takes an input file that is formatted in a very specific manner. Parses through this input to determine a workable schedule for the user. The input includes</w:t>
+      </w:r>
+      <w:r>
+        <w:rPr>
+          <w:rFonts w:ascii="Book Antiqua" w:hAnsi="Book Antiqua"/>
+          <w:color w:val="0F4761" w:themeColor="accent1" w:themeShade="BF"/>
+          <w:sz w:val="20"/>
+          <w:szCs w:val="20"/>
+        </w:rPr>
+        <w:t xml:space="preserve"> the names of each subject being scheduled, the start times of whatever they are being scheduled for, and the constraints that must be followed (I.e. Employee 1 can’t work at 9am, and Employee’s 3 and 4 can’t work at the same time)</w:t>
+      </w:r>
+    </w:p>
+    <w:p>
+      <w:pPr>
+        <w:pStyle w:val="ListParagraph"/>
+        <w:numPr>
+          <w:ilvl w:val="0"/>
+          <w:numId w:val="7"/>
+        </w:numPr>
+        <w:rPr>
+          <w:rFonts w:ascii="Book Antiqua" w:hAnsi="Book Antiqua"/>
+          <w:color w:val="0F4761" w:themeColor="accent1" w:themeShade="BF"/>
+          <w:sz w:val="20"/>
+          <w:szCs w:val="20"/>
+        </w:rPr>
+      </w:pPr>
+      <w:r>
+        <w:rPr>
+          <w:rFonts w:ascii="Book Antiqua" w:hAnsi="Book Antiqua"/>
+          <w:color w:val="0F4761" w:themeColor="accent1" w:themeShade="BF"/>
+          <w:sz w:val="20"/>
+          <w:szCs w:val="20"/>
+        </w:rPr>
+        <w:t>Card Game Challenger</w:t>
+      </w:r>
+    </w:p>
+    <w:p>
+      <w:pPr>
+        <w:pStyle w:val="ListParagraph"/>
+        <w:numPr>
+          <w:ilvl w:val="1"/>
+          <w:numId w:val="7"/>
+        </w:numPr>
+        <w:rPr>
+          <w:rFonts w:ascii="Book Antiqua" w:hAnsi="Book Antiqua"/>
+          <w:color w:val="0F4761" w:themeColor="accent1" w:themeShade="BF"/>
+          <w:sz w:val="20"/>
+          <w:szCs w:val="20"/>
+        </w:rPr>
+      </w:pPr>
+      <w:r>
+        <w:rPr>
+          <w:rFonts w:ascii="Book Antiqua" w:hAnsi="Book Antiqua"/>
+          <w:color w:val="0F4761" w:themeColor="accent1" w:themeShade="BF"/>
+          <w:sz w:val="20"/>
+          <w:szCs w:val="20"/>
+        </w:rPr>
+        <w:t>“Card Game Challenger” had a team of 5 developers</w:t>
+      </w:r>
+      <w:r>
+        <w:rPr>
+          <w:rFonts w:ascii="Book Antiqua" w:hAnsi="Book Antiqua"/>
+          <w:color w:val="0F4761" w:themeColor="accent1" w:themeShade="BF"/>
+          <w:sz w:val="20"/>
+          <w:szCs w:val="20"/>
+        </w:rPr>
+        <w:t xml:space="preserve"> created using Java</w:t>
+      </w:r>
+      <w:r>
+        <w:rPr>
+          <w:rFonts w:ascii="Book Antiqua" w:hAnsi="Book Antiqua"/>
+          <w:color w:val="0F4761" w:themeColor="accent1" w:themeShade="BF"/>
+          <w:sz w:val="20"/>
+          <w:szCs w:val="20"/>
+        </w:rPr>
+        <w:t xml:space="preserve">. </w:t>
+      </w:r>
+      <w:r>
+        <w:rPr>
+          <w:rFonts w:ascii="Book Antiqua" w:hAnsi="Book Antiqua"/>
+          <w:color w:val="0F4761" w:themeColor="accent1" w:themeShade="BF"/>
+          <w:sz w:val="20"/>
+          <w:szCs w:val="20"/>
+        </w:rPr>
+        <w:t>The project was never completed but was in a working state.</w:t>
+      </w:r>
+    </w:p>
+    <w:p>
+      <w:pPr>
+        <w:pStyle w:val="ListParagraph"/>
+        <w:numPr>
+          <w:ilvl w:val="1"/>
+          <w:numId w:val="7"/>
+        </w:numPr>
+        <w:rPr>
+          <w:rFonts w:ascii="Book Antiqua" w:hAnsi="Book Antiqua"/>
+          <w:color w:val="0F4761" w:themeColor="accent1" w:themeShade="BF"/>
+          <w:sz w:val="20"/>
+          <w:szCs w:val="20"/>
+        </w:rPr>
+      </w:pPr>
+      <w:r>
+        <w:rPr>
+          <w:rFonts w:ascii="Book Antiqua" w:hAnsi="Book Antiqua"/>
+          <w:color w:val="0F4761" w:themeColor="accent1" w:themeShade="BF"/>
+          <w:sz w:val="20"/>
+          <w:szCs w:val="20"/>
+        </w:rPr>
+        <w:t xml:space="preserve">“Card Game Challenger” is a single player </w:t>
+      </w:r>
+      <w:r>
+        <w:rPr>
+          <w:rFonts w:ascii="Book Antiqua" w:hAnsi="Book Antiqua"/>
+          <w:color w:val="0F4761" w:themeColor="accent1" w:themeShade="BF"/>
+          <w:sz w:val="20"/>
+          <w:szCs w:val="20"/>
+        </w:rPr>
+        <w:t xml:space="preserve">game in a birds-eye view in which the user is in a small open world map with NPC’s spread out around the world for the user to talk to and initialize card games such as Poker, Blackjack, and High Card. </w:t>
+      </w:r>
+    </w:p>
+    <w:p>
+      <w:pPr>
+        <w:pStyle w:val="ListParagraph"/>
+        <w:numPr>
+          <w:ilvl w:val="1"/>
+          <w:numId w:val="7"/>
+        </w:numPr>
+        <w:rPr>
+          <w:rFonts w:ascii="Book Antiqua" w:hAnsi="Book Antiqua"/>
+          <w:color w:val="0F4761" w:themeColor="accent1" w:themeShade="BF"/>
+          <w:sz w:val="20"/>
+          <w:szCs w:val="20"/>
+        </w:rPr>
+      </w:pPr>
+      <w:r>
+        <w:rPr>
+          <w:rFonts w:ascii="Book Antiqua" w:hAnsi="Book Antiqua"/>
+          <w:color w:val="0F4761" w:themeColor="accent1" w:themeShade="BF"/>
+          <w:sz w:val="20"/>
+          <w:szCs w:val="20"/>
+        </w:rPr>
+        <w:t xml:space="preserve">The open world movement, NPC’s code, and card games are all in the source code, though the card games are inaccessible. Launching the card games when talking to an NPC </w:t>
+      </w:r>
+      <w:r>
+        <w:rPr>
+          <w:rFonts w:ascii="Book Antiqua" w:hAnsi="Book Antiqua"/>
+          <w:color w:val="0F4761" w:themeColor="accent1" w:themeShade="BF"/>
+          <w:sz w:val="20"/>
+          <w:szCs w:val="20"/>
+        </w:rPr>
+        <w:t>was the final unfinished task for the project.</w:t>
+      </w:r>
+    </w:p>
+    <w:p>
+      <w:pPr>
+        <w:pStyle w:val="ListParagraph"/>
+        <w:numPr>
+          <w:ilvl w:val="0"/>
+          <w:numId w:val="7"/>
+        </w:numPr>
+        <w:rPr>
+          <w:rFonts w:ascii="Book Antiqua" w:hAnsi="Book Antiqua"/>
+          <w:color w:val="0F4761" w:themeColor="accent1" w:themeShade="BF"/>
+          <w:sz w:val="20"/>
+          <w:szCs w:val="20"/>
+        </w:rPr>
+      </w:pPr>
+      <w:r>
+        <w:rPr>
+          <w:rFonts w:ascii="Book Antiqua" w:hAnsi="Book Antiqua"/>
+          <w:color w:val="0F4761" w:themeColor="accent1" w:themeShade="BF"/>
+          <w:sz w:val="20"/>
+          <w:szCs w:val="20"/>
+        </w:rPr>
+        <w:t>Untitled Game Launcher</w:t>
+      </w:r>
+    </w:p>
+    <w:p>
+      <w:pPr>
+        <w:pStyle w:val="ListParagraph"/>
+        <w:numPr>
+          <w:ilvl w:val="1"/>
+          <w:numId w:val="7"/>
+        </w:numPr>
+        <w:rPr>
+          <w:rFonts w:ascii="Book Antiqua" w:hAnsi="Book Antiqua"/>
+          <w:color w:val="0F4761" w:themeColor="accent1" w:themeShade="BF"/>
+          <w:sz w:val="20"/>
+          <w:szCs w:val="20"/>
+        </w:rPr>
+      </w:pPr>
+      <w:r>
+        <w:rPr>
+          <w:rFonts w:ascii="Book Antiqua" w:hAnsi="Book Antiqua"/>
+          <w:color w:val="0F4761" w:themeColor="accent1" w:themeShade="BF"/>
+          <w:sz w:val="20"/>
+          <w:szCs w:val="20"/>
+        </w:rPr>
+        <w:t>The most recently started project currently in development still is a game launcher being developed in the QT C++ framework by 2 developers.</w:t>
+      </w:r>
+    </w:p>
+    <w:p>
+      <w:pPr>
+        <w:pStyle w:val="ListParagraph"/>
+        <w:numPr>
+          <w:ilvl w:val="1"/>
+          <w:numId w:val="7"/>
+        </w:numPr>
+        <w:rPr>
+          <w:rFonts w:ascii="Book Antiqua" w:hAnsi="Book Antiqua"/>
+          <w:color w:val="0F4761" w:themeColor="accent1" w:themeShade="BF"/>
+          <w:sz w:val="20"/>
+          <w:szCs w:val="20"/>
+        </w:rPr>
+      </w:pPr>
+      <w:r>
+        <w:rPr>
+          <w:rFonts w:ascii="Book Antiqua" w:hAnsi="Book Antiqua"/>
+          <w:color w:val="0F4761" w:themeColor="accent1" w:themeShade="BF"/>
+          <w:sz w:val="20"/>
+          <w:szCs w:val="20"/>
+        </w:rPr>
+        <w:t xml:space="preserve">This launcher is meant to be an easy means of organizing and managing every game on the user’s system. Using APIs to connect to other launchers such as Steam to </w:t>
+      </w:r>
+      <w:r>
+        <w:rPr>
+          <w:rFonts w:ascii="Book Antiqua" w:hAnsi="Book Antiqua"/>
+          <w:color w:val="0F4761" w:themeColor="accent1" w:themeShade="BF"/>
+          <w:sz w:val="20"/>
+          <w:szCs w:val="20"/>
+        </w:rPr>
+        <w:t>combine</w:t>
+      </w:r>
+      <w:r>
+        <w:rPr>
+          <w:rFonts w:ascii="Book Antiqua" w:hAnsi="Book Antiqua"/>
+          <w:color w:val="0F4761" w:themeColor="accent1" w:themeShade="BF"/>
+          <w:sz w:val="20"/>
+          <w:szCs w:val="20"/>
+        </w:rPr>
+        <w:t xml:space="preserve"> every game in</w:t>
+      </w:r>
+      <w:r>
+        <w:rPr>
+          <w:rFonts w:ascii="Book Antiqua" w:hAnsi="Book Antiqua"/>
+          <w:color w:val="0F4761" w:themeColor="accent1" w:themeShade="BF"/>
+          <w:sz w:val="20"/>
+          <w:szCs w:val="20"/>
+        </w:rPr>
+        <w:t xml:space="preserve">to a single library that works as a </w:t>
+      </w:r>
+      <w:r>
+        <w:rPr>
+          <w:rFonts w:ascii="Book Antiqua" w:hAnsi="Book Antiqua"/>
+          <w:color w:val="0F4761" w:themeColor="accent1" w:themeShade="BF"/>
+          <w:sz w:val="20"/>
+          <w:szCs w:val="20"/>
+        </w:rPr>
+        <w:t>sort of tool bar on the side of the user’s screen.</w:t>
+      </w:r>
+    </w:p>
     <w:sectPr>
       <w:pgSz w:w="12240" w:h="15840"/>
       <w:pgMar w:top="864" w:right="864" w:bottom="864" w:left="864" w:header="720" w:footer="720" w:gutter="0"/>
@@ -599,6 +1261,434 @@
 <file path=word/numbering.xml><?xml version="1.0" encoding="utf-8"?>
 <w:numbering xmlns:wpc="http://schemas.microsoft.com/office/word/2010/wordprocessingCanvas" xmlns:cx="http://schemas.microsoft.com/office/drawing/2014/chartex" xmlns:cx1="http://schemas.microsoft.com/office/drawing/2015/9/8/chartex" xmlns:cx2="http://schemas.microsoft.com/office/drawing/2015/10/21/chartex" xmlns:cx3="http://schemas.microsoft.com/office/drawing/2016/5/9/chartex" xmlns:cx4="http://schemas.microsoft.com/office/drawing/2016/5/10/chartex" xmlns:cx5="http://schemas.microsoft.com/office/drawing/2016/5/11/chartex" xmlns:cx6="http://schemas.microsoft.com/office/drawing/2016/5/12/chartex" xmlns:cx7="http://schemas.microsoft.com/office/drawing/2016/5/13/chartex" xmlns:cx8="http://schemas.microsoft.com/office/drawing/2016/5/14/chartex" xmlns:mc="http://schemas.openxmlformats.org/markup-compatibility/2006" xmlns:aink="http://schemas.microsoft.com/office/drawing/2016/ink" xmlns:am3d="http://schemas.microsoft.com/office/drawing/2017/model3d" xmlns:o="urn:schemas-microsoft-com:office:office" xmlns:oel="http://schemas.microsoft.com/office/2019/extlst" xmlns:r="http://schemas.openxmlformats.org/officeDocument/2006/relationships" xmlns:m="http://schemas.openxmlformats.org/officeDocument/2006/math" xmlns:v="urn:schemas-microsoft-com:vml" xmlns:wp14="http://schemas.microsoft.com/office/word/2010/wordprocessingDrawing" xmlns:wp="http://schemas.openxmlformats.org/drawingml/2006/wordprocessingDrawing" xmlns:w10="urn:schemas-microsoft-com:office:word" xmlns:w="http://schemas.openxmlformats.org/wordprocessingml/2006/main" xmlns:w14="http://schemas.microsoft.com/office/word/2010/wordml" xmlns:w15="http://schemas.microsoft.com/office/word/2012/wordml" xmlns:w16cex="http://schemas.microsoft.com/office/word/2018/wordml/cex" xmlns:w16cid="http://schemas.microsoft.com/office/word/2016/wordml/cid" xmlns:w16="http://schemas.microsoft.com/office/word/2018/wordml" xmlns:w16du="http://schemas.microsoft.com/office/word/2023/wordml/word16du" xmlns:w16sdtdh="http://schemas.microsoft.com/office/word/2020/wordml/sdtdatahash" xmlns:w16sdtfl="http://schemas.microsoft.com/office/word/2024/wordml/sdtformatlock" xmlns:w16se="http://schemas.microsoft.com/office/word/2015/wordml/symex" xmlns:wpg="http://schemas.microsoft.com/office/word/2010/wordprocessingGroup" xmlns:wpi="http://schemas.microsoft.com/office/word/2010/wordprocessingInk" xmlns:wne="http://schemas.microsoft.com/office/word/2006/wordml" xmlns:wps="http://schemas.microsoft.com/office/word/2010/wordprocessingShape" mc:Ignorable="w14 w15 w16se w16cid w16 w16cex w16sdtdh w16sdtfl w16du wp14">
   <w:abstractNum w:abstractNumId="0" w15:restartNumberingAfterBreak="0">
+    <w:nsid w:val="22067379"/>
+    <w:multiLevelType w:val="hybridMultilevel"/>
+    <w:tmpl w:val="7DD60BCA"/>
+    <w:lvl w:ilvl="0" w:tplc="04090001">
+      <w:start w:val="1"/>
+      <w:numFmt w:val="bullet"/>
+      <w:lvlText w:val=""/>
+      <w:lvlJc w:val="left"/>
+      <w:pPr>
+        <w:ind w:left="720" w:hanging="360"/>
+      </w:pPr>
+      <w:rPr>
+        <w:rFonts w:ascii="Symbol" w:hAnsi="Symbol" w:hint="default"/>
+      </w:rPr>
+    </w:lvl>
+    <w:lvl w:ilvl="1" w:tplc="04090003" w:tentative="1">
+      <w:start w:val="1"/>
+      <w:numFmt w:val="bullet"/>
+      <w:lvlText w:val="o"/>
+      <w:lvlJc w:val="left"/>
+      <w:pPr>
+        <w:ind w:left="1440" w:hanging="360"/>
+      </w:pPr>
+      <w:rPr>
+        <w:rFonts w:ascii="Courier New" w:hAnsi="Courier New" w:cs="Courier New" w:hint="default"/>
+      </w:rPr>
+    </w:lvl>
+    <w:lvl w:ilvl="2" w:tplc="04090005" w:tentative="1">
+      <w:start w:val="1"/>
+      <w:numFmt w:val="bullet"/>
+      <w:lvlText w:val=""/>
+      <w:lvlJc w:val="left"/>
+      <w:pPr>
+        <w:ind w:left="2160" w:hanging="360"/>
+      </w:pPr>
+      <w:rPr>
+        <w:rFonts w:ascii="Wingdings" w:hAnsi="Wingdings" w:hint="default"/>
+      </w:rPr>
+    </w:lvl>
+    <w:lvl w:ilvl="3" w:tplc="04090001" w:tentative="1">
+      <w:start w:val="1"/>
+      <w:numFmt w:val="bullet"/>
+      <w:lvlText w:val=""/>
+      <w:lvlJc w:val="left"/>
+      <w:pPr>
+        <w:ind w:left="2880" w:hanging="360"/>
+      </w:pPr>
+      <w:rPr>
+        <w:rFonts w:ascii="Symbol" w:hAnsi="Symbol" w:hint="default"/>
+      </w:rPr>
+    </w:lvl>
+    <w:lvl w:ilvl="4" w:tplc="04090003" w:tentative="1">
+      <w:start w:val="1"/>
+      <w:numFmt w:val="bullet"/>
+      <w:lvlText w:val="o"/>
+      <w:lvlJc w:val="left"/>
+      <w:pPr>
+        <w:ind w:left="3600" w:hanging="360"/>
+      </w:pPr>
+      <w:rPr>
+        <w:rFonts w:ascii="Courier New" w:hAnsi="Courier New" w:cs="Courier New" w:hint="default"/>
+      </w:rPr>
+    </w:lvl>
+    <w:lvl w:ilvl="5" w:tplc="04090005" w:tentative="1">
+      <w:start w:val="1"/>
+      <w:numFmt w:val="bullet"/>
+      <w:lvlText w:val=""/>
+      <w:lvlJc w:val="left"/>
+      <w:pPr>
+        <w:ind w:left="4320" w:hanging="360"/>
+      </w:pPr>
+      <w:rPr>
+        <w:rFonts w:ascii="Wingdings" w:hAnsi="Wingdings" w:hint="default"/>
+      </w:rPr>
+    </w:lvl>
+    <w:lvl w:ilvl="6" w:tplc="04090001" w:tentative="1">
+      <w:start w:val="1"/>
+      <w:numFmt w:val="bullet"/>
+      <w:lvlText w:val=""/>
+      <w:lvlJc w:val="left"/>
+      <w:pPr>
+        <w:ind w:left="5040" w:hanging="360"/>
+      </w:pPr>
+      <w:rPr>
+        <w:rFonts w:ascii="Symbol" w:hAnsi="Symbol" w:hint="default"/>
+      </w:rPr>
+    </w:lvl>
+    <w:lvl w:ilvl="7" w:tplc="04090003" w:tentative="1">
+      <w:start w:val="1"/>
+      <w:numFmt w:val="bullet"/>
+      <w:lvlText w:val="o"/>
+      <w:lvlJc w:val="left"/>
+      <w:pPr>
+        <w:ind w:left="5760" w:hanging="360"/>
+      </w:pPr>
+      <w:rPr>
+        <w:rFonts w:ascii="Courier New" w:hAnsi="Courier New" w:cs="Courier New" w:hint="default"/>
+      </w:rPr>
+    </w:lvl>
+    <w:lvl w:ilvl="8" w:tplc="04090005" w:tentative="1">
+      <w:start w:val="1"/>
+      <w:numFmt w:val="bullet"/>
+      <w:lvlText w:val=""/>
+      <w:lvlJc w:val="left"/>
+      <w:pPr>
+        <w:ind w:left="6480" w:hanging="360"/>
+      </w:pPr>
+      <w:rPr>
+        <w:rFonts w:ascii="Wingdings" w:hAnsi="Wingdings" w:hint="default"/>
+      </w:rPr>
+    </w:lvl>
+  </w:abstractNum>
+  <w:abstractNum w:abstractNumId="1" w15:restartNumberingAfterBreak="0">
+    <w:nsid w:val="38DB75DF"/>
+    <w:multiLevelType w:val="hybridMultilevel"/>
+    <w:tmpl w:val="64E89BC2"/>
+    <w:lvl w:ilvl="0" w:tplc="04090001">
+      <w:start w:val="1"/>
+      <w:numFmt w:val="bullet"/>
+      <w:lvlText w:val=""/>
+      <w:lvlJc w:val="left"/>
+      <w:pPr>
+        <w:ind w:left="720" w:hanging="360"/>
+      </w:pPr>
+      <w:rPr>
+        <w:rFonts w:ascii="Symbol" w:hAnsi="Symbol" w:hint="default"/>
+      </w:rPr>
+    </w:lvl>
+    <w:lvl w:ilvl="1" w:tplc="04090003" w:tentative="1">
+      <w:start w:val="1"/>
+      <w:numFmt w:val="bullet"/>
+      <w:lvlText w:val="o"/>
+      <w:lvlJc w:val="left"/>
+      <w:pPr>
+        <w:ind w:left="1440" w:hanging="360"/>
+      </w:pPr>
+      <w:rPr>
+        <w:rFonts w:ascii="Courier New" w:hAnsi="Courier New" w:cs="Courier New" w:hint="default"/>
+      </w:rPr>
+    </w:lvl>
+    <w:lvl w:ilvl="2" w:tplc="04090005" w:tentative="1">
+      <w:start w:val="1"/>
+      <w:numFmt w:val="bullet"/>
+      <w:lvlText w:val=""/>
+      <w:lvlJc w:val="left"/>
+      <w:pPr>
+        <w:ind w:left="2160" w:hanging="360"/>
+      </w:pPr>
+      <w:rPr>
+        <w:rFonts w:ascii="Wingdings" w:hAnsi="Wingdings" w:hint="default"/>
+      </w:rPr>
+    </w:lvl>
+    <w:lvl w:ilvl="3" w:tplc="04090001" w:tentative="1">
+      <w:start w:val="1"/>
+      <w:numFmt w:val="bullet"/>
+      <w:lvlText w:val=""/>
+      <w:lvlJc w:val="left"/>
+      <w:pPr>
+        <w:ind w:left="2880" w:hanging="360"/>
+      </w:pPr>
+      <w:rPr>
+        <w:rFonts w:ascii="Symbol" w:hAnsi="Symbol" w:hint="default"/>
+      </w:rPr>
+    </w:lvl>
+    <w:lvl w:ilvl="4" w:tplc="04090003" w:tentative="1">
+      <w:start w:val="1"/>
+      <w:numFmt w:val="bullet"/>
+      <w:lvlText w:val="o"/>
+      <w:lvlJc w:val="left"/>
+      <w:pPr>
+        <w:ind w:left="3600" w:hanging="360"/>
+      </w:pPr>
+      <w:rPr>
+        <w:rFonts w:ascii="Courier New" w:hAnsi="Courier New" w:cs="Courier New" w:hint="default"/>
+      </w:rPr>
+    </w:lvl>
+    <w:lvl w:ilvl="5" w:tplc="04090005" w:tentative="1">
+      <w:start w:val="1"/>
+      <w:numFmt w:val="bullet"/>
+      <w:lvlText w:val=""/>
+      <w:lvlJc w:val="left"/>
+      <w:pPr>
+        <w:ind w:left="4320" w:hanging="360"/>
+      </w:pPr>
+      <w:rPr>
+        <w:rFonts w:ascii="Wingdings" w:hAnsi="Wingdings" w:hint="default"/>
+      </w:rPr>
+    </w:lvl>
+    <w:lvl w:ilvl="6" w:tplc="04090001" w:tentative="1">
+      <w:start w:val="1"/>
+      <w:numFmt w:val="bullet"/>
+      <w:lvlText w:val=""/>
+      <w:lvlJc w:val="left"/>
+      <w:pPr>
+        <w:ind w:left="5040" w:hanging="360"/>
+      </w:pPr>
+      <w:rPr>
+        <w:rFonts w:ascii="Symbol" w:hAnsi="Symbol" w:hint="default"/>
+      </w:rPr>
+    </w:lvl>
+    <w:lvl w:ilvl="7" w:tplc="04090003" w:tentative="1">
+      <w:start w:val="1"/>
+      <w:numFmt w:val="bullet"/>
+      <w:lvlText w:val="o"/>
+      <w:lvlJc w:val="left"/>
+      <w:pPr>
+        <w:ind w:left="5760" w:hanging="360"/>
+      </w:pPr>
+      <w:rPr>
+        <w:rFonts w:ascii="Courier New" w:hAnsi="Courier New" w:cs="Courier New" w:hint="default"/>
+      </w:rPr>
+    </w:lvl>
+    <w:lvl w:ilvl="8" w:tplc="04090005" w:tentative="1">
+      <w:start w:val="1"/>
+      <w:numFmt w:val="bullet"/>
+      <w:lvlText w:val=""/>
+      <w:lvlJc w:val="left"/>
+      <w:pPr>
+        <w:ind w:left="6480" w:hanging="360"/>
+      </w:pPr>
+      <w:rPr>
+        <w:rFonts w:ascii="Wingdings" w:hAnsi="Wingdings" w:hint="default"/>
+      </w:rPr>
+    </w:lvl>
+  </w:abstractNum>
+  <w:abstractNum w:abstractNumId="2" w15:restartNumberingAfterBreak="0">
+    <w:nsid w:val="51836339"/>
+    <w:multiLevelType w:val="hybridMultilevel"/>
+    <w:tmpl w:val="B66E4F16"/>
+    <w:lvl w:ilvl="0" w:tplc="CAB88996">
+      <w:start w:val="1"/>
+      <w:numFmt w:val="bullet"/>
+      <w:lvlText w:val=""/>
+      <w:lvlJc w:val="left"/>
+      <w:pPr>
+        <w:tabs>
+          <w:tab w:val="num" w:pos="720"/>
+        </w:tabs>
+        <w:ind w:left="720" w:hanging="360"/>
+      </w:pPr>
+      <w:rPr>
+        <w:rFonts w:ascii="Wingdings" w:hAnsi="Wingdings" w:hint="default"/>
+      </w:rPr>
+    </w:lvl>
+    <w:lvl w:ilvl="1" w:tplc="04090003">
+      <w:start w:val="1"/>
+      <w:numFmt w:val="bullet"/>
+      <w:lvlText w:val="o"/>
+      <w:lvlJc w:val="left"/>
+      <w:pPr>
+        <w:ind w:left="1440" w:hanging="360"/>
+      </w:pPr>
+      <w:rPr>
+        <w:rFonts w:ascii="Courier New" w:hAnsi="Courier New" w:cs="Courier New" w:hint="default"/>
+      </w:rPr>
+    </w:lvl>
+    <w:lvl w:ilvl="2" w:tplc="04090005" w:tentative="1">
+      <w:start w:val="1"/>
+      <w:numFmt w:val="bullet"/>
+      <w:lvlText w:val=""/>
+      <w:lvlJc w:val="left"/>
+      <w:pPr>
+        <w:ind w:left="2160" w:hanging="360"/>
+      </w:pPr>
+      <w:rPr>
+        <w:rFonts w:ascii="Wingdings" w:hAnsi="Wingdings" w:hint="default"/>
+      </w:rPr>
+    </w:lvl>
+    <w:lvl w:ilvl="3" w:tplc="04090001" w:tentative="1">
+      <w:start w:val="1"/>
+      <w:numFmt w:val="bullet"/>
+      <w:lvlText w:val=""/>
+      <w:lvlJc w:val="left"/>
+      <w:pPr>
+        <w:ind w:left="2880" w:hanging="360"/>
+      </w:pPr>
+      <w:rPr>
+        <w:rFonts w:ascii="Symbol" w:hAnsi="Symbol" w:hint="default"/>
+      </w:rPr>
+    </w:lvl>
+    <w:lvl w:ilvl="4" w:tplc="04090003" w:tentative="1">
+      <w:start w:val="1"/>
+      <w:numFmt w:val="bullet"/>
+      <w:lvlText w:val="o"/>
+      <w:lvlJc w:val="left"/>
+      <w:pPr>
+        <w:ind w:left="3600" w:hanging="360"/>
+      </w:pPr>
+      <w:rPr>
+        <w:rFonts w:ascii="Courier New" w:hAnsi="Courier New" w:cs="Courier New" w:hint="default"/>
+      </w:rPr>
+    </w:lvl>
+    <w:lvl w:ilvl="5" w:tplc="04090005" w:tentative="1">
+      <w:start w:val="1"/>
+      <w:numFmt w:val="bullet"/>
+      <w:lvlText w:val=""/>
+      <w:lvlJc w:val="left"/>
+      <w:pPr>
+        <w:ind w:left="4320" w:hanging="360"/>
+      </w:pPr>
+      <w:rPr>
+        <w:rFonts w:ascii="Wingdings" w:hAnsi="Wingdings" w:hint="default"/>
+      </w:rPr>
+    </w:lvl>
+    <w:lvl w:ilvl="6" w:tplc="04090001" w:tentative="1">
+      <w:start w:val="1"/>
+      <w:numFmt w:val="bullet"/>
+      <w:lvlText w:val=""/>
+      <w:lvlJc w:val="left"/>
+      <w:pPr>
+        <w:ind w:left="5040" w:hanging="360"/>
+      </w:pPr>
+      <w:rPr>
+        <w:rFonts w:ascii="Symbol" w:hAnsi="Symbol" w:hint="default"/>
+      </w:rPr>
+    </w:lvl>
+    <w:lvl w:ilvl="7" w:tplc="04090003" w:tentative="1">
+      <w:start w:val="1"/>
+      <w:numFmt w:val="bullet"/>
+      <w:lvlText w:val="o"/>
+      <w:lvlJc w:val="left"/>
+      <w:pPr>
+        <w:ind w:left="5760" w:hanging="360"/>
+      </w:pPr>
+      <w:rPr>
+        <w:rFonts w:ascii="Courier New" w:hAnsi="Courier New" w:cs="Courier New" w:hint="default"/>
+      </w:rPr>
+    </w:lvl>
+    <w:lvl w:ilvl="8" w:tplc="04090005" w:tentative="1">
+      <w:start w:val="1"/>
+      <w:numFmt w:val="bullet"/>
+      <w:lvlText w:val=""/>
+      <w:lvlJc w:val="left"/>
+      <w:pPr>
+        <w:ind w:left="6480" w:hanging="360"/>
+      </w:pPr>
+      <w:rPr>
+        <w:rFonts w:ascii="Wingdings" w:hAnsi="Wingdings" w:hint="default"/>
+      </w:rPr>
+    </w:lvl>
+  </w:abstractNum>
+  <w:abstractNum w:abstractNumId="3" w15:restartNumberingAfterBreak="0">
+    <w:nsid w:val="57B04ED4"/>
+    <w:multiLevelType w:val="hybridMultilevel"/>
+    <w:tmpl w:val="C4BE1F7A"/>
+    <w:lvl w:ilvl="0" w:tplc="0409000F">
+      <w:start w:val="1"/>
+      <w:numFmt w:val="decimal"/>
+      <w:lvlText w:val="%1."/>
+      <w:lvlJc w:val="left"/>
+      <w:pPr>
+        <w:ind w:left="720" w:hanging="360"/>
+      </w:pPr>
+    </w:lvl>
+    <w:lvl w:ilvl="1" w:tplc="04090019" w:tentative="1">
+      <w:start w:val="1"/>
+      <w:numFmt w:val="lowerLetter"/>
+      <w:lvlText w:val="%2."/>
+      <w:lvlJc w:val="left"/>
+      <w:pPr>
+        <w:ind w:left="1440" w:hanging="360"/>
+      </w:pPr>
+    </w:lvl>
+    <w:lvl w:ilvl="2" w:tplc="0409001B" w:tentative="1">
+      <w:start w:val="1"/>
+      <w:numFmt w:val="lowerRoman"/>
+      <w:lvlText w:val="%3."/>
+      <w:lvlJc w:val="right"/>
+      <w:pPr>
+        <w:ind w:left="2160" w:hanging="180"/>
+      </w:pPr>
+    </w:lvl>
+    <w:lvl w:ilvl="3" w:tplc="0409000F" w:tentative="1">
+      <w:start w:val="1"/>
+      <w:numFmt w:val="decimal"/>
+      <w:lvlText w:val="%4."/>
+      <w:lvlJc w:val="left"/>
+      <w:pPr>
+        <w:ind w:left="2880" w:hanging="360"/>
+      </w:pPr>
+    </w:lvl>
+    <w:lvl w:ilvl="4" w:tplc="04090019" w:tentative="1">
+      <w:start w:val="1"/>
+      <w:numFmt w:val="lowerLetter"/>
+      <w:lvlText w:val="%5."/>
+      <w:lvlJc w:val="left"/>
+      <w:pPr>
+        <w:ind w:left="3600" w:hanging="360"/>
+      </w:pPr>
+    </w:lvl>
+    <w:lvl w:ilvl="5" w:tplc="0409001B" w:tentative="1">
+      <w:start w:val="1"/>
+      <w:numFmt w:val="lowerRoman"/>
+      <w:lvlText w:val="%6."/>
+      <w:lvlJc w:val="right"/>
+      <w:pPr>
+        <w:ind w:left="4320" w:hanging="180"/>
+      </w:pPr>
+    </w:lvl>
+    <w:lvl w:ilvl="6" w:tplc="0409000F" w:tentative="1">
+      <w:start w:val="1"/>
+      <w:numFmt w:val="decimal"/>
+      <w:lvlText w:val="%7."/>
+      <w:lvlJc w:val="left"/>
+      <w:pPr>
+        <w:ind w:left="5040" w:hanging="360"/>
+      </w:pPr>
+    </w:lvl>
+    <w:lvl w:ilvl="7" w:tplc="04090019" w:tentative="1">
+      <w:start w:val="1"/>
+      <w:numFmt w:val="lowerLetter"/>
+      <w:lvlText w:val="%8."/>
+      <w:lvlJc w:val="left"/>
+      <w:pPr>
+        <w:ind w:left="5760" w:hanging="360"/>
+      </w:pPr>
+    </w:lvl>
+    <w:lvl w:ilvl="8" w:tplc="0409001B" w:tentative="1">
+      <w:start w:val="1"/>
+      <w:numFmt w:val="lowerRoman"/>
+      <w:lvlText w:val="%9."/>
+      <w:lvlJc w:val="right"/>
+      <w:pPr>
+        <w:ind w:left="6480" w:hanging="180"/>
+      </w:pPr>
+    </w:lvl>
+  </w:abstractNum>
+  <w:abstractNum w:abstractNumId="4" w15:restartNumberingAfterBreak="0">
     <w:nsid w:val="5A3D253F"/>
     <w:multiLevelType w:val="hybridMultilevel"/>
     <w:tmpl w:val="1826F23A"/>
@@ -738,10 +1828,123 @@
       </w:rPr>
     </w:lvl>
   </w:abstractNum>
-  <w:abstractNum w:abstractNumId="1" w15:restartNumberingAfterBreak="0">
+  <w:abstractNum w:abstractNumId="5" w15:restartNumberingAfterBreak="0">
+    <w:nsid w:val="5C9B7A91"/>
+    <w:multiLevelType w:val="hybridMultilevel"/>
+    <w:tmpl w:val="A9F6BB9E"/>
+    <w:lvl w:ilvl="0" w:tplc="04090005">
+      <w:start w:val="1"/>
+      <w:numFmt w:val="bullet"/>
+      <w:lvlText w:val=""/>
+      <w:lvlJc w:val="left"/>
+      <w:pPr>
+        <w:ind w:left="720" w:hanging="360"/>
+      </w:pPr>
+      <w:rPr>
+        <w:rFonts w:ascii="Wingdings" w:hAnsi="Wingdings" w:hint="default"/>
+      </w:rPr>
+    </w:lvl>
+    <w:lvl w:ilvl="1" w:tplc="04090003" w:tentative="1">
+      <w:start w:val="1"/>
+      <w:numFmt w:val="bullet"/>
+      <w:lvlText w:val="o"/>
+      <w:lvlJc w:val="left"/>
+      <w:pPr>
+        <w:ind w:left="1440" w:hanging="360"/>
+      </w:pPr>
+      <w:rPr>
+        <w:rFonts w:ascii="Courier New" w:hAnsi="Courier New" w:cs="Courier New" w:hint="default"/>
+      </w:rPr>
+    </w:lvl>
+    <w:lvl w:ilvl="2" w:tplc="04090005" w:tentative="1">
+      <w:start w:val="1"/>
+      <w:numFmt w:val="bullet"/>
+      <w:lvlText w:val=""/>
+      <w:lvlJc w:val="left"/>
+      <w:pPr>
+        <w:ind w:left="2160" w:hanging="360"/>
+      </w:pPr>
+      <w:rPr>
+        <w:rFonts w:ascii="Wingdings" w:hAnsi="Wingdings" w:hint="default"/>
+      </w:rPr>
+    </w:lvl>
+    <w:lvl w:ilvl="3" w:tplc="04090001" w:tentative="1">
+      <w:start w:val="1"/>
+      <w:numFmt w:val="bullet"/>
+      <w:lvlText w:val=""/>
+      <w:lvlJc w:val="left"/>
+      <w:pPr>
+        <w:ind w:left="2880" w:hanging="360"/>
+      </w:pPr>
+      <w:rPr>
+        <w:rFonts w:ascii="Symbol" w:hAnsi="Symbol" w:hint="default"/>
+      </w:rPr>
+    </w:lvl>
+    <w:lvl w:ilvl="4" w:tplc="04090003" w:tentative="1">
+      <w:start w:val="1"/>
+      <w:numFmt w:val="bullet"/>
+      <w:lvlText w:val="o"/>
+      <w:lvlJc w:val="left"/>
+      <w:pPr>
+        <w:ind w:left="3600" w:hanging="360"/>
+      </w:pPr>
+      <w:rPr>
+        <w:rFonts w:ascii="Courier New" w:hAnsi="Courier New" w:cs="Courier New" w:hint="default"/>
+      </w:rPr>
+    </w:lvl>
+    <w:lvl w:ilvl="5" w:tplc="04090005" w:tentative="1">
+      <w:start w:val="1"/>
+      <w:numFmt w:val="bullet"/>
+      <w:lvlText w:val=""/>
+      <w:lvlJc w:val="left"/>
+      <w:pPr>
+        <w:ind w:left="4320" w:hanging="360"/>
+      </w:pPr>
+      <w:rPr>
+        <w:rFonts w:ascii="Wingdings" w:hAnsi="Wingdings" w:hint="default"/>
+      </w:rPr>
+    </w:lvl>
+    <w:lvl w:ilvl="6" w:tplc="04090001" w:tentative="1">
+      <w:start w:val="1"/>
+      <w:numFmt w:val="bullet"/>
+      <w:lvlText w:val=""/>
+      <w:lvlJc w:val="left"/>
+      <w:pPr>
+        <w:ind w:left="5040" w:hanging="360"/>
+      </w:pPr>
+      <w:rPr>
+        <w:rFonts w:ascii="Symbol" w:hAnsi="Symbol" w:hint="default"/>
+      </w:rPr>
+    </w:lvl>
+    <w:lvl w:ilvl="7" w:tplc="04090003" w:tentative="1">
+      <w:start w:val="1"/>
+      <w:numFmt w:val="bullet"/>
+      <w:lvlText w:val="o"/>
+      <w:lvlJc w:val="left"/>
+      <w:pPr>
+        <w:ind w:left="5760" w:hanging="360"/>
+      </w:pPr>
+      <w:rPr>
+        <w:rFonts w:ascii="Courier New" w:hAnsi="Courier New" w:cs="Courier New" w:hint="default"/>
+      </w:rPr>
+    </w:lvl>
+    <w:lvl w:ilvl="8" w:tplc="04090005" w:tentative="1">
+      <w:start w:val="1"/>
+      <w:numFmt w:val="bullet"/>
+      <w:lvlText w:val=""/>
+      <w:lvlJc w:val="left"/>
+      <w:pPr>
+        <w:ind w:left="6480" w:hanging="360"/>
+      </w:pPr>
+      <w:rPr>
+        <w:rFonts w:ascii="Wingdings" w:hAnsi="Wingdings" w:hint="default"/>
+      </w:rPr>
+    </w:lvl>
+  </w:abstractNum>
+  <w:abstractNum w:abstractNumId="6" w15:restartNumberingAfterBreak="0">
     <w:nsid w:val="6FC0791D"/>
     <w:multiLevelType w:val="hybridMultilevel"/>
-    <w:tmpl w:val="41BAC766"/>
+    <w:tmpl w:val="2A9884A8"/>
     <w:lvl w:ilvl="0" w:tplc="CAB88996">
       <w:start w:val="1"/>
       <w:numFmt w:val="bullet"/>
@@ -879,10 +2082,25 @@
     </w:lvl>
   </w:abstractNum>
   <w:num w:numId="1" w16cid:durableId="1611739409">
+    <w:abstractNumId w:val="4"/>
+  </w:num>
+  <w:num w:numId="2" w16cid:durableId="1495098301">
+    <w:abstractNumId w:val="6"/>
+  </w:num>
+  <w:num w:numId="3" w16cid:durableId="1407848620">
+    <w:abstractNumId w:val="1"/>
+  </w:num>
+  <w:num w:numId="4" w16cid:durableId="916398369">
     <w:abstractNumId w:val="0"/>
   </w:num>
-  <w:num w:numId="2" w16cid:durableId="1495098301">
-    <w:abstractNumId w:val="1"/>
+  <w:num w:numId="5" w16cid:durableId="1215846110">
+    <w:abstractNumId w:val="3"/>
+  </w:num>
+  <w:num w:numId="6" w16cid:durableId="1134981593">
+    <w:abstractNumId w:val="5"/>
+  </w:num>
+  <w:num w:numId="7" w16cid:durableId="927082320">
+    <w:abstractNumId w:val="2"/>
   </w:num>
 </w:numbering>
 </file>

</xml_diff>